<commit_message>
Initial Flutter project setup
</commit_message>
<xml_diff>
--- a/Documentation/Milestone 02 - Mid-Project Review/BSc Project Report Template_2025.docx
+++ b/Documentation/Milestone 02 - Mid-Project Review/BSc Project Report Template_2025.docx
@@ -1478,7 +1478,7 @@
               </wp:anchor>
             </w:drawing>
           </mc:Choice>
-          <mc:Fallback xmlns:a="http://schemas.openxmlformats.org/drawingml/2006/main" xmlns:wp14="http://schemas.microsoft.com/office/word/2010/wordml">
+          <mc:Fallback xmlns:wp14="http://schemas.microsoft.com/office/word/2010/wordml" xmlns:a="http://schemas.openxmlformats.org/drawingml/2006/main">
             <w:pict w14:anchorId="507C7D5A">
               <v:rect xmlns:wp14="http://schemas.microsoft.com/office/word/2010/wordprocessingDrawing" id="shape_0" style="position:absolute;margin-left:-6.9pt;margin-top:126.3pt;width:462.05pt;height:55.7pt;mso-position-vertical-relative:page" fillcolor="white" stroked="f" ID="Text Box 217" wp14:anchorId="5FF0F485">
                 <w10:wrap type="square"/>
@@ -1729,7 +1729,7 @@
               </wp:anchor>
             </w:drawing>
           </mc:Choice>
-          <mc:Fallback xmlns:a="http://schemas.openxmlformats.org/drawingml/2006/main" xmlns:wp14="http://schemas.microsoft.com/office/word/2010/wordml">
+          <mc:Fallback xmlns:wp14="http://schemas.microsoft.com/office/word/2010/wordml" xmlns:a="http://schemas.openxmlformats.org/drawingml/2006/main">
             <w:pict w14:anchorId="07B02EC9">
               <v:rect xmlns:wp14="http://schemas.microsoft.com/office/word/2010/wordprocessingDrawing" id="shape_0" style="position:absolute;margin-left:0pt;margin-top:31.05pt;width:462.05pt;height:62pt" fillcolor="white" stroked="f" ID="Text Box 1" wp14:anchorId="143C8C30">
                 <w10:wrap type="square"/>
@@ -2061,7 +2061,7 @@
               </wp:anchor>
             </w:drawing>
           </mc:Choice>
-          <mc:Fallback xmlns:a="http://schemas.openxmlformats.org/drawingml/2006/main" xmlns:wp14="http://schemas.microsoft.com/office/word/2010/wordml">
+          <mc:Fallback xmlns:wp14="http://schemas.microsoft.com/office/word/2010/wordml" xmlns:a="http://schemas.openxmlformats.org/drawingml/2006/main">
             <w:pict w14:anchorId="5BA35190">
               <v:rect xmlns:wp14="http://schemas.microsoft.com/office/word/2010/wordprocessingDrawing" id="shape_0" style="position:absolute;margin-left:-0.85pt;margin-top:29.05pt;width:462.05pt;height:187.8pt" fillcolor="white" stroked="f" ID="Text Box 2" wp14:anchorId="70535279">
                 <w10:wrap type="square"/>
@@ -2437,7 +2437,7 @@
               </wp:anchor>
             </w:drawing>
           </mc:Choice>
-          <mc:Fallback xmlns:a="http://schemas.openxmlformats.org/drawingml/2006/main" xmlns:wp14="http://schemas.microsoft.com/office/word/2010/wordml">
+          <mc:Fallback xmlns:wp14="http://schemas.microsoft.com/office/word/2010/wordml" xmlns:a="http://schemas.openxmlformats.org/drawingml/2006/main">
             <w:pict w14:anchorId="1CEFD3A0">
               <v:rect xmlns:wp14="http://schemas.microsoft.com/office/word/2010/wordprocessingDrawing" id="shape_0" style="position:absolute;margin-left:-13.7pt;margin-top:29pt;width:455.5pt;height:182.5pt;mso-position-horizontal:right;mso-position-horizontal-relative:margin" fillcolor="white" stroked="f" ID="Text Box 4" wp14:anchorId="064CD028">
                 <w10:wrap type="square"/>
@@ -2632,7 +2632,7 @@
               </wp:anchor>
             </w:drawing>
           </mc:Choice>
-          <mc:Fallback xmlns:a="http://schemas.openxmlformats.org/drawingml/2006/main" xmlns:wp14="http://schemas.microsoft.com/office/word/2010/wordml">
+          <mc:Fallback xmlns:wp14="http://schemas.microsoft.com/office/word/2010/wordml" xmlns:a="http://schemas.openxmlformats.org/drawingml/2006/main">
             <w:pict w14:anchorId="3943D5B5">
               <v:rect xmlns:wp14="http://schemas.microsoft.com/office/word/2010/wordprocessingDrawing" id="shape_0" style="position:absolute;margin-left:-0.15pt;margin-top:377.85pt;width:462.9pt;height:28.35pt" fillcolor="white" stroked="f" ID="Text Box 5" wp14:anchorId="313DE285">
                 <w10:wrap type="square"/>
@@ -2759,7 +2759,7 @@
               </wp:anchor>
             </w:drawing>
           </mc:Choice>
-          <mc:Fallback xmlns:a="http://schemas.openxmlformats.org/drawingml/2006/main" xmlns:wp14="http://schemas.microsoft.com/office/word/2010/wordml">
+          <mc:Fallback xmlns:wp14="http://schemas.microsoft.com/office/word/2010/wordml" xmlns:a="http://schemas.openxmlformats.org/drawingml/2006/main">
             <w:pict w14:anchorId="3313F100">
               <v:rect xmlns:wp14="http://schemas.microsoft.com/office/word/2010/wordprocessingDrawing" id="shape_0" style="position:absolute;margin-left:-0.25pt;margin-top:263.8pt;width:462.9pt;height:28.35pt" fillcolor="white" stroked="f" ID="Text Box 6" wp14:anchorId="2B45E65E">
                 <w10:wrap type="square"/>
@@ -2897,7 +2897,7 @@
               </wp:anchor>
             </w:drawing>
           </mc:Choice>
-          <mc:Fallback xmlns:a="http://schemas.openxmlformats.org/drawingml/2006/main" xmlns:wp14="http://schemas.microsoft.com/office/word/2010/wordml">
+          <mc:Fallback xmlns:wp14="http://schemas.microsoft.com/office/word/2010/wordml" xmlns:a="http://schemas.openxmlformats.org/drawingml/2006/main">
             <w:pict w14:anchorId="2562E3AE">
               <v:rect xmlns:wp14="http://schemas.microsoft.com/office/word/2010/wordprocessingDrawing" id="shape_0" style="position:absolute;margin-left:-0.1pt;margin-top:295.55pt;width:462.9pt;height:28.35pt" fillcolor="white" stroked="f" ID="Text Box 7" wp14:anchorId="44B2C5F2">
                 <w10:wrap type="square"/>
@@ -6260,23 +6260,7 @@
           <w:rFonts w:eastAsia="Calibri" w:cs="Calibri"/>
           <w:color w:val="507BC8"/>
         </w:rPr>
-        <w:t xml:space="preserve"> have you learned during the project? Why were you able and unable to meet project goals? What would have </w:t>
-      </w:r>
-      <w:proofErr w:type="gramStart"/>
-      <w:r>
-        <w:rPr>
-          <w:rFonts w:eastAsia="Calibri" w:cs="Calibri"/>
-          <w:color w:val="507BC8"/>
-        </w:rPr>
-        <w:t>you</w:t>
-      </w:r>
-      <w:proofErr w:type="gramEnd"/>
-      <w:r>
-        <w:rPr>
-          <w:rFonts w:eastAsia="Calibri" w:cs="Calibri"/>
-          <w:color w:val="507BC8"/>
-        </w:rPr>
-        <w:t xml:space="preserve"> done differently in hindsight?  Write this section in the first person.</w:t>
+        <w:t xml:space="preserve"> have you learned during the project? Why were you able and unable to meet project goals? What would have you done differently in hindsight?  Write this section in the first person.</w:t>
       </w:r>
       <w:r>
         <w:br w:type="page"/>

</xml_diff>